<commit_message>
Release: integrated Benchmark, free/pro gating, and public-repo cleanup
Adds the integrated Helcyon-Bench workspace (prompt packs, rubrics,
judge engine, dashboard, leaderboard) with free/pro feature gating,
rewrites README/LICENCE/setup docs for the new product structure, and
removes internal-only artefacts ahead of the public release.

Co-Authored-By: Claude Sonnet 5 <noreply@anthropic.com>
</commit_message>
<xml_diff>
--- a/HWUI_Setup_Guide.docx
+++ b/HWUI_Setup_Guide.docx
@@ -246,6 +246,20 @@
       <w:r>
         <w:rPr/>
         <w:t>Memory, characters, user personas, projects, documents and web search</w:t>
+      </w:r>
+    </w:p>
+    <w:p>
+      <w:pPr>
+        <w:pStyle w:val="Normal"/>
+        <w:numPr>
+          <w:ilvl w:val="0"/>
+          <w:numId w:val="7"/>
+        </w:numPr>
+        <w:rPr/>
+      </w:pPr>
+      <w:r>
+        <w:rPr/>
+        <w:t>The integrated Benchmark workspace: prompt packs, rubrics, browsing, dashboard and leaderboard</w:t>
       </w:r>
     </w:p>
     <w:p>
@@ -1109,6 +1123,38 @@
           </w:p>
         </w:tc>
       </w:tr>
+      <w:tr>
+        <w:tc>
+          <w:tcPr>
+            <w:tcW w:type="dxa" w:w="2100"/>
+          </w:tcPr>
+          <w:p>
+            <w:r>
+              <w:t>Benchmark</w:t>
+            </w:r>
+          </w:p>
+        </w:tc>
+        <w:tc>
+          <w:tcPr>
+            <w:tcW w:type="dxa" w:w="2500"/>
+          </w:tcPr>
+          <w:p>
+            <w:r>
+              <w:t>Ready</w:t>
+            </w:r>
+          </w:p>
+        </w:tc>
+        <w:tc>
+          <w:tcPr>
+            <w:tcW w:type="dxa" w:w="4760"/>
+          </w:tcPr>
+          <w:p>
+            <w:r>
+              <w:t>Bundled prompt packs, rubrics and judge engine (no extra setup)</w:t>
+            </w:r>
+          </w:p>
+        </w:tc>
+      </w:tr>
     </w:tbl>
     <w:p>
       <w:pPr>
@@ -1256,7 +1302,7 @@
       </w:pPr>
       <w:r>
         <w:rPr/>
-        <w:t>5. Text-to-speech engines</w:t>
+        <w:t>5. Using the integrated Benchmark</w:t>
       </w:r>
     </w:p>
     <w:p>
@@ -1270,7 +1316,7 @@
       </w:pPr>
       <w:r>
         <w:rPr/>
-        <w:t>6. Whisper voice input</w:t>
+        <w:t>6. Text-to-speech engines</w:t>
       </w:r>
     </w:p>
     <w:p>
@@ -1284,7 +1330,7 @@
       </w:pPr>
       <w:r>
         <w:rPr/>
-        <w:t>7. Mobile and network access</w:t>
+        <w:t>7. Whisper voice input</w:t>
       </w:r>
     </w:p>
     <w:p>
@@ -1298,7 +1344,7 @@
       </w:pPr>
       <w:r>
         <w:rPr/>
-        <w:t>8. Backups and updates</w:t>
+        <w:t>8. Mobile and network access</w:t>
       </w:r>
     </w:p>
     <w:p>
@@ -1312,7 +1358,21 @@
       </w:pPr>
       <w:r>
         <w:rPr/>
-        <w:t>9. Troubleshooting and reference</w:t>
+        <w:t>9. Backups and updates</w:t>
+      </w:r>
+    </w:p>
+    <w:p>
+      <w:pPr>
+        <w:pStyle w:val="Normal"/>
+        <w:numPr>
+          <w:ilvl w:val="0"/>
+          <w:numId w:val="7"/>
+        </w:numPr>
+        <w:rPr/>
+      </w:pPr>
+      <w:r>
+        <w:rPr/>
+        <w:t>10. Troubleshooting and reference</w:t>
       </w:r>
     </w:p>
     <w:p>
@@ -3113,7 +3173,7 @@
           <w:color w:val="20364A"/>
           <w:sz w:val="18"/>
         </w:rPr>
-        <w:t>python -m pip install flask flask-cors requests psutil openai-whisper python-docx odfpy PyPDF2</w:t>
+        <w:t>python -m pip install flask flask-cors requests psutil faster-whisper openai-whisper python-docx odfpy PyPDF2 PyYAML</w:t>
       </w:r>
     </w:p>
     <w:p>
@@ -4985,7 +5045,7 @@
               <w:rPr>
                 <w:color w:val="20364A"/>
               </w:rPr>
-              <w:t>The public edition includes the complete memory system and built-in theme switcher. The visual Theme Editor button links to the £10 Pro edition.</w:t>
+              <w:t>The public edition includes the complete memory system and built-in theme switcher. The visual Theme Editor button links to the £20 Pro edition.</w:t>
             </w:r>
           </w:p>
         </w:tc>
@@ -5021,7 +5081,192 @@
       </w:pPr>
       <w:r>
         <w:rPr/>
-        <w:t>5. Text-to-speech overview</w:t>
+        <w:t>5. Using the integrated Benchmark</w:t>
+      </w:r>
+    </w:p>
+    <w:p>
+      <w:pPr>
+        <w:pStyle w:val="Normal"/>
+        <w:rPr/>
+      </w:pPr>
+      <w:r>
+        <w:rPr/>
+        <w:t>The integrated Benchmark workspace lives on the Config page. It is HWUI's own native benchmark tool, not the separate standalone Helcyon-Bench Streamlit project; bundled prompt packs, rubrics and saved results are used directly, with no extra installation.</w:t>
+      </w:r>
+    </w:p>
+    <w:p>
+      <w:pPr>
+        <w:pStyle w:val="Heading2"/>
+        <w:rPr/>
+      </w:pPr>
+      <w:r>
+        <w:rPr/>
+        <w:t>Prompt packs and rubrics</w:t>
+      </w:r>
+    </w:p>
+    <w:p>
+      <w:pPr>
+        <w:pStyle w:val="Normal"/>
+        <w:numPr>
+          <w:ilvl w:val="0"/>
+          <w:numId w:val="7"/>
+        </w:numPr>
+        <w:rPr/>
+      </w:pPr>
+      <w:r>
+        <w:rPr/>
+        <w:t>Open Config → Helcyon-Bench to browse the bundled prompt packs and categories.</w:t>
+      </w:r>
+    </w:p>
+    <w:p>
+      <w:pPr>
+        <w:pStyle w:val="Normal"/>
+        <w:numPr>
+          <w:ilvl w:val="0"/>
+          <w:numId w:val="7"/>
+        </w:numPr>
+        <w:rPr/>
+      </w:pPr>
+      <w:r>
+        <w:rPr/>
+        <w:t>Use the Prompt Pack Editor to create or edit a five-prompt pack for a category.</w:t>
+      </w:r>
+    </w:p>
+    <w:p>
+      <w:pPr>
+        <w:pStyle w:val="Normal"/>
+        <w:numPr>
+          <w:ilvl w:val="0"/>
+          <w:numId w:val="7"/>
+        </w:numPr>
+        <w:rPr/>
+      </w:pPr>
+      <w:r>
+        <w:rPr/>
+        <w:t>Use the Rubric Editor to adjust the scoring criteria the judge grades against.</w:t>
+      </w:r>
+    </w:p>
+    <w:p>
+      <w:pPr>
+        <w:pStyle w:val="Heading2"/>
+        <w:rPr/>
+      </w:pPr>
+      <w:r>
+        <w:rPr/>
+        <w:t>Browsing results</w:t>
+      </w:r>
+    </w:p>
+    <w:p>
+      <w:pPr>
+        <w:pStyle w:val="Normal"/>
+        <w:numPr>
+          <w:ilvl w:val="0"/>
+          <w:numId w:val="7"/>
+        </w:numPr>
+        <w:rPr/>
+      </w:pPr>
+      <w:r>
+        <w:rPr/>
+        <w:t>The Benchmark Browser lists every saved comparison and prompt pack.</w:t>
+      </w:r>
+    </w:p>
+    <w:p>
+      <w:pPr>
+        <w:pStyle w:val="Normal"/>
+        <w:numPr>
+          <w:ilvl w:val="0"/>
+          <w:numId w:val="7"/>
+        </w:numPr>
+        <w:rPr/>
+      </w:pPr>
+      <w:r>
+        <w:rPr/>
+        <w:t>The Dashboard breaks results down per model and category, with strengths, weaknesses and trends.</w:t>
+      </w:r>
+    </w:p>
+    <w:p>
+      <w:pPr>
+        <w:pStyle w:val="Normal"/>
+        <w:numPr>
+          <w:ilvl w:val="0"/>
+          <w:numId w:val="7"/>
+        </w:numPr>
+        <w:rPr/>
+      </w:pPr>
+      <w:r>
+        <w:rPr/>
+        <w:t>The Leaderboard ranks models by Current, Best or Historical score.</w:t>
+      </w:r>
+    </w:p>
+    <w:p>
+      <w:pPr>
+        <w:pStyle w:val="Heading2"/>
+        <w:rPr/>
+      </w:pPr>
+      <w:r>
+        <w:rPr/>
+        <w:t>Free and Pro features</w:t>
+      </w:r>
+    </w:p>
+    <w:p>
+      <w:pPr>
+        <w:pStyle w:val="Normal"/>
+        <w:numPr>
+          <w:ilvl w:val="0"/>
+          <w:numId w:val="7"/>
+        </w:numPr>
+        <w:rPr/>
+      </w:pPr>
+      <w:r>
+        <w:rPr/>
+        <w:t>Prompt Pack Editor, Rubric Editor, Benchmark Browser, Dashboard and Leaderboard are included in this public build.</w:t>
+      </w:r>
+    </w:p>
+    <w:p>
+      <w:pPr>
+        <w:pStyle w:val="Normal"/>
+        <w:numPr>
+          <w:ilvl w:val="0"/>
+          <w:numId w:val="7"/>
+        </w:numPr>
+        <w:rPr/>
+      </w:pPr>
+      <w:r>
+        <w:rPr/>
+        <w:t>Sending a benchmark prompt straight into chat and capturing the exact reply back into a candidate slot, running the automated judge across a full pack, and saving or resuming full benchmark sessions are HWUI Pro features.</w:t>
+      </w:r>
+    </w:p>
+    <w:p>
+      <w:pPr>
+        <w:pStyle w:val="Normal"/>
+        <w:spacing w:before="0" w:after="40"/>
+        <w:rPr/>
+      </w:pPr>
+      <w:r>
+        <w:rPr/>
+      </w:r>
+    </w:p>
+    <w:p>
+      <w:pPr>
+        <w:pStyle w:val="Normal"/>
+        <w:rPr/>
+      </w:pPr>
+      <w:r>
+        <w:rPr/>
+      </w:r>
+      <w:r>
+        <w:br w:type="page"/>
+      </w:r>
+    </w:p>
+    <w:p>
+      <w:pPr>
+        <w:pStyle w:val="Heading1"/>
+        <w:spacing w:before="0" w:after="200"/>
+        <w:rPr/>
+      </w:pPr>
+      <w:r>
+        <w:rPr/>
+        <w:t>6. Text-to-speech overview</w:t>
       </w:r>
     </w:p>
     <w:p>
@@ -6105,7 +6350,7 @@
       </w:pPr>
       <w:r>
         <w:rPr/>
-        <w:t>5A. F5-TTS</w:t>
+        <w:t>6A. F5-TTS</w:t>
       </w:r>
     </w:p>
     <w:p>
@@ -6455,7 +6700,7 @@
       </w:pPr>
       <w:r>
         <w:rPr/>
-        <w:t>5B. Chatterbox</w:t>
+        <w:t>6B. Chatterbox</w:t>
       </w:r>
     </w:p>
     <w:p>
@@ -6748,7 +6993,7 @@
       </w:pPr>
       <w:r>
         <w:rPr/>
-        <w:t>5C. Qwen3-TTS Fast</w:t>
+        <w:t>6C. Qwen3-TTS Fast</w:t>
       </w:r>
     </w:p>
     <w:p>
@@ -7083,7 +7328,7 @@
       </w:pPr>
       <w:r>
         <w:rPr/>
-        <w:t>5D. XTTS and Kokoro</w:t>
+        <w:t>6D. XTTS and Kokoro</w:t>
       </w:r>
     </w:p>
     <w:p>
@@ -7370,7 +7615,7 @@
       </w:pPr>
       <w:r>
         <w:rPr/>
-        <w:t>6. Whisper voice input</w:t>
+        <w:t>7. Whisper voice input</w:t>
       </w:r>
     </w:p>
     <w:p>
@@ -8083,7 +8328,7 @@
       </w:pPr>
       <w:r>
         <w:rPr/>
-        <w:t>7. Mobile and network access</w:t>
+        <w:t>8. Mobile and network access</w:t>
       </w:r>
     </w:p>
     <w:p>
@@ -8225,7 +8470,7 @@
       </w:pPr>
       <w:r>
         <w:rPr/>
-        <w:t>8. Backups and updates</w:t>
+        <w:t>9. Backups and updates</w:t>
       </w:r>
     </w:p>
     <w:p>
@@ -8973,7 +9218,7 @@
       </w:pPr>
       <w:r>
         <w:rPr/>
-        <w:t>9. Troubleshooting</w:t>
+        <w:t>10. Troubleshooting</w:t>
       </w:r>
     </w:p>
     <w:p>
@@ -10540,7 +10785,7 @@
             <w:color w:val="2E74B5"/>
             <w:u w:val="single"/>
           </w:rPr>
-          <w:t>HWUI Pro Theme Editor</w:t>
+          <w:t>HWUI Pro (Theme Editor, automated Benchmark)</w:t>
         </w:r>
       </w:hyperlink>
       <w:r>

</xml_diff>